<commit_message>
Fix volume unit to 万股 and amount to 亿元
</commit_message>
<xml_diff>
--- a/Stock/data/supply_chain_reports/20260610/daily_digest.docx
+++ b/Stock/data/supply_chain_reports/20260610/daily_digest.docx
@@ -13,7 +13,7 @@
     </w:p>
     <w:p>
       <w:r>
-        <w:t>数据来源：新浪财经 | 生成时间：2026-06-10 19:08:59</w:t>
+        <w:t>数据来源：新浪财经 | 生成时间：2026-06-10 19:18:18</w:t>
       </w:r>
     </w:p>
     <w:p>
@@ -211,17 +211,18 @@
         <w:tblLook w:firstColumn="1" w:firstRow="1" w:lastColumn="0" w:lastRow="0" w:noHBand="0" w:noVBand="1" w:val="04A0"/>
       </w:tblPr>
       <w:tblGrid>
-        <w:gridCol w:w="1440"/>
-        <w:gridCol w:w="1440"/>
-        <w:gridCol w:w="1440"/>
-        <w:gridCol w:w="1440"/>
-        <w:gridCol w:w="1440"/>
-        <w:gridCol w:w="1440"/>
+        <w:gridCol w:w="1234"/>
+        <w:gridCol w:w="1234"/>
+        <w:gridCol w:w="1234"/>
+        <w:gridCol w:w="1234"/>
+        <w:gridCol w:w="1234"/>
+        <w:gridCol w:w="1234"/>
+        <w:gridCol w:w="1234"/>
       </w:tblGrid>
       <w:tr>
         <w:tc>
           <w:tcPr>
-            <w:tcW w:type="dxa" w:w="1440"/>
+            <w:tcW w:type="dxa" w:w="1234"/>
           </w:tcPr>
           <w:p>
             <w:r>
@@ -231,7 +232,7 @@
         </w:tc>
         <w:tc>
           <w:tcPr>
-            <w:tcW w:type="dxa" w:w="1440"/>
+            <w:tcW w:type="dxa" w:w="1234"/>
           </w:tcPr>
           <w:p>
             <w:r>
@@ -241,7 +242,7 @@
         </w:tc>
         <w:tc>
           <w:tcPr>
-            <w:tcW w:type="dxa" w:w="1440"/>
+            <w:tcW w:type="dxa" w:w="1234"/>
           </w:tcPr>
           <w:p>
             <w:r>
@@ -251,17 +252,17 @@
         </w:tc>
         <w:tc>
           <w:tcPr>
-            <w:tcW w:type="dxa" w:w="1440"/>
-          </w:tcPr>
-          <w:p>
-            <w:r>
-              <w:t>收盘价</w:t>
-            </w:r>
-          </w:p>
-        </w:tc>
-        <w:tc>
-          <w:tcPr>
-            <w:tcW w:type="dxa" w:w="1440"/>
+            <w:tcW w:type="dxa" w:w="1234"/>
+          </w:tcPr>
+          <w:p>
+            <w:r>
+              <w:t>收盘价(元)</w:t>
+            </w:r>
+          </w:p>
+        </w:tc>
+        <w:tc>
+          <w:tcPr>
+            <w:tcW w:type="dxa" w:w="1234"/>
           </w:tcPr>
           <w:p>
             <w:r>
@@ -271,11 +272,21 @@
         </w:tc>
         <w:tc>
           <w:tcPr>
-            <w:tcW w:type="dxa" w:w="1440"/>
-          </w:tcPr>
-          <w:p>
-            <w:r>
-              <w:t>成交量</w:t>
+            <w:tcW w:type="dxa" w:w="1234"/>
+          </w:tcPr>
+          <w:p>
+            <w:r>
+              <w:t>成交量(万股)</w:t>
+            </w:r>
+          </w:p>
+        </w:tc>
+        <w:tc>
+          <w:tcPr>
+            <w:tcW w:type="dxa" w:w="1234"/>
+          </w:tcPr>
+          <w:p>
+            <w:r>
+              <w:t>成交额(亿元)</w:t>
             </w:r>
           </w:p>
         </w:tc>
@@ -283,7 +294,7 @@
       <w:tr>
         <w:tc>
           <w:tcPr>
-            <w:tcW w:type="dxa" w:w="1440"/>
+            <w:tcW w:type="dxa" w:w="1234"/>
           </w:tcPr>
           <w:p>
             <w:r>
@@ -293,7 +304,7 @@
         </w:tc>
         <w:tc>
           <w:tcPr>
-            <w:tcW w:type="dxa" w:w="1440"/>
+            <w:tcW w:type="dxa" w:w="1234"/>
           </w:tcPr>
           <w:p>
             <w:r>
@@ -303,7 +314,7 @@
         </w:tc>
         <w:tc>
           <w:tcPr>
-            <w:tcW w:type="dxa" w:w="1440"/>
+            <w:tcW w:type="dxa" w:w="1234"/>
           </w:tcPr>
           <w:p>
             <w:r>
@@ -313,7 +324,7 @@
         </w:tc>
         <w:tc>
           <w:tcPr>
-            <w:tcW w:type="dxa" w:w="1440"/>
+            <w:tcW w:type="dxa" w:w="1234"/>
           </w:tcPr>
           <w:p>
             <w:r>
@@ -323,7 +334,7 @@
         </w:tc>
         <w:tc>
           <w:tcPr>
-            <w:tcW w:type="dxa" w:w="1440"/>
+            <w:tcW w:type="dxa" w:w="1234"/>
           </w:tcPr>
           <w:p>
             <w:r>
@@ -333,11 +344,21 @@
         </w:tc>
         <w:tc>
           <w:tcPr>
-            <w:tcW w:type="dxa" w:w="1440"/>
-          </w:tcPr>
-          <w:p>
-            <w:r>
-              <w:t>3,228,480,444</w:t>
+            <w:tcW w:type="dxa" w:w="1234"/>
+          </w:tcPr>
+          <w:p>
+            <w:r>
+              <w:t>322848.04</w:t>
+            </w:r>
+          </w:p>
+        </w:tc>
+        <w:tc>
+          <w:tcPr>
+            <w:tcW w:type="dxa" w:w="1234"/>
+          </w:tcPr>
+          <w:p>
+            <w:r>
+              <w:t>196.46</w:t>
             </w:r>
           </w:p>
         </w:tc>
@@ -345,7 +366,7 @@
       <w:tr>
         <w:tc>
           <w:tcPr>
-            <w:tcW w:type="dxa" w:w="1440"/>
+            <w:tcW w:type="dxa" w:w="1234"/>
           </w:tcPr>
           <w:p>
             <w:r>
@@ -355,7 +376,7 @@
         </w:tc>
         <w:tc>
           <w:tcPr>
-            <w:tcW w:type="dxa" w:w="1440"/>
+            <w:tcW w:type="dxa" w:w="1234"/>
           </w:tcPr>
           <w:p>
             <w:r>
@@ -365,7 +386,7 @@
         </w:tc>
         <w:tc>
           <w:tcPr>
-            <w:tcW w:type="dxa" w:w="1440"/>
+            <w:tcW w:type="dxa" w:w="1234"/>
           </w:tcPr>
           <w:p>
             <w:r>
@@ -375,7 +396,7 @@
         </w:tc>
         <w:tc>
           <w:tcPr>
-            <w:tcW w:type="dxa" w:w="1440"/>
+            <w:tcW w:type="dxa" w:w="1234"/>
           </w:tcPr>
           <w:p>
             <w:r>
@@ -385,7 +406,7 @@
         </w:tc>
         <w:tc>
           <w:tcPr>
-            <w:tcW w:type="dxa" w:w="1440"/>
+            <w:tcW w:type="dxa" w:w="1234"/>
           </w:tcPr>
           <w:p>
             <w:r>
@@ -395,11 +416,21 @@
         </w:tc>
         <w:tc>
           <w:tcPr>
-            <w:tcW w:type="dxa" w:w="1440"/>
-          </w:tcPr>
-          <w:p>
-            <w:r>
-              <w:t>297,211,385</w:t>
+            <w:tcW w:type="dxa" w:w="1234"/>
+          </w:tcPr>
+          <w:p>
+            <w:r>
+              <w:t>29721.14</w:t>
+            </w:r>
+          </w:p>
+        </w:tc>
+        <w:tc>
+          <w:tcPr>
+            <w:tcW w:type="dxa" w:w="1234"/>
+          </w:tcPr>
+          <w:p>
+            <w:r>
+              <w:t>98.54</w:t>
             </w:r>
           </w:p>
         </w:tc>
@@ -407,7 +438,7 @@
       <w:tr>
         <w:tc>
           <w:tcPr>
-            <w:tcW w:type="dxa" w:w="1440"/>
+            <w:tcW w:type="dxa" w:w="1234"/>
           </w:tcPr>
           <w:p>
             <w:r>
@@ -417,7 +448,7 @@
         </w:tc>
         <w:tc>
           <w:tcPr>
-            <w:tcW w:type="dxa" w:w="1440"/>
+            <w:tcW w:type="dxa" w:w="1234"/>
           </w:tcPr>
           <w:p>
             <w:r>
@@ -427,7 +458,7 @@
         </w:tc>
         <w:tc>
           <w:tcPr>
-            <w:tcW w:type="dxa" w:w="1440"/>
+            <w:tcW w:type="dxa" w:w="1234"/>
           </w:tcPr>
           <w:p>
             <w:r>
@@ -437,7 +468,7 @@
         </w:tc>
         <w:tc>
           <w:tcPr>
-            <w:tcW w:type="dxa" w:w="1440"/>
+            <w:tcW w:type="dxa" w:w="1234"/>
           </w:tcPr>
           <w:p>
             <w:r>
@@ -447,7 +478,7 @@
         </w:tc>
         <w:tc>
           <w:tcPr>
-            <w:tcW w:type="dxa" w:w="1440"/>
+            <w:tcW w:type="dxa" w:w="1234"/>
           </w:tcPr>
           <w:p>
             <w:r>
@@ -457,11 +488,21 @@
         </w:tc>
         <w:tc>
           <w:tcPr>
-            <w:tcW w:type="dxa" w:w="1440"/>
-          </w:tcPr>
-          <w:p>
-            <w:r>
-              <w:t>237,907,122</w:t>
+            <w:tcW w:type="dxa" w:w="1234"/>
+          </w:tcPr>
+          <w:p>
+            <w:r>
+              <w:t>23790.71</w:t>
+            </w:r>
+          </w:p>
+        </w:tc>
+        <w:tc>
+          <w:tcPr>
+            <w:tcW w:type="dxa" w:w="1234"/>
+          </w:tcPr>
+          <w:p>
+            <w:r>
+              <w:t>41.01</w:t>
             </w:r>
           </w:p>
         </w:tc>
@@ -469,7 +510,7 @@
       <w:tr>
         <w:tc>
           <w:tcPr>
-            <w:tcW w:type="dxa" w:w="1440"/>
+            <w:tcW w:type="dxa" w:w="1234"/>
           </w:tcPr>
           <w:p>
             <w:r>
@@ -479,7 +520,7 @@
         </w:tc>
         <w:tc>
           <w:tcPr>
-            <w:tcW w:type="dxa" w:w="1440"/>
+            <w:tcW w:type="dxa" w:w="1234"/>
           </w:tcPr>
           <w:p>
             <w:r>
@@ -489,7 +530,7 @@
         </w:tc>
         <w:tc>
           <w:tcPr>
-            <w:tcW w:type="dxa" w:w="1440"/>
+            <w:tcW w:type="dxa" w:w="1234"/>
           </w:tcPr>
           <w:p>
             <w:r>
@@ -499,7 +540,7 @@
         </w:tc>
         <w:tc>
           <w:tcPr>
-            <w:tcW w:type="dxa" w:w="1440"/>
+            <w:tcW w:type="dxa" w:w="1234"/>
           </w:tcPr>
           <w:p>
             <w:r>
@@ -509,7 +550,7 @@
         </w:tc>
         <w:tc>
           <w:tcPr>
-            <w:tcW w:type="dxa" w:w="1440"/>
+            <w:tcW w:type="dxa" w:w="1234"/>
           </w:tcPr>
           <w:p>
             <w:r>
@@ -519,11 +560,21 @@
         </w:tc>
         <w:tc>
           <w:tcPr>
-            <w:tcW w:type="dxa" w:w="1440"/>
-          </w:tcPr>
-          <w:p>
-            <w:r>
-              <w:t>183,587,927</w:t>
+            <w:tcW w:type="dxa" w:w="1234"/>
+          </w:tcPr>
+          <w:p>
+            <w:r>
+              <w:t>18358.79</w:t>
+            </w:r>
+          </w:p>
+        </w:tc>
+        <w:tc>
+          <w:tcPr>
+            <w:tcW w:type="dxa" w:w="1234"/>
+          </w:tcPr>
+          <w:p>
+            <w:r>
+              <w:t>9.38</w:t>
             </w:r>
           </w:p>
         </w:tc>
@@ -531,7 +582,7 @@
       <w:tr>
         <w:tc>
           <w:tcPr>
-            <w:tcW w:type="dxa" w:w="1440"/>
+            <w:tcW w:type="dxa" w:w="1234"/>
           </w:tcPr>
           <w:p>
             <w:r>
@@ -541,7 +592,7 @@
         </w:tc>
         <w:tc>
           <w:tcPr>
-            <w:tcW w:type="dxa" w:w="1440"/>
+            <w:tcW w:type="dxa" w:w="1234"/>
           </w:tcPr>
           <w:p>
             <w:r>
@@ -551,7 +602,7 @@
         </w:tc>
         <w:tc>
           <w:tcPr>
-            <w:tcW w:type="dxa" w:w="1440"/>
+            <w:tcW w:type="dxa" w:w="1234"/>
           </w:tcPr>
           <w:p>
             <w:r>
@@ -561,7 +612,7 @@
         </w:tc>
         <w:tc>
           <w:tcPr>
-            <w:tcW w:type="dxa" w:w="1440"/>
+            <w:tcW w:type="dxa" w:w="1234"/>
           </w:tcPr>
           <w:p>
             <w:r>
@@ -571,7 +622,7 @@
         </w:tc>
         <w:tc>
           <w:tcPr>
-            <w:tcW w:type="dxa" w:w="1440"/>
+            <w:tcW w:type="dxa" w:w="1234"/>
           </w:tcPr>
           <w:p>
             <w:r>
@@ -581,11 +632,21 @@
         </w:tc>
         <w:tc>
           <w:tcPr>
-            <w:tcW w:type="dxa" w:w="1440"/>
-          </w:tcPr>
-          <w:p>
-            <w:r>
-              <w:t>118,284,059</w:t>
+            <w:tcW w:type="dxa" w:w="1234"/>
+          </w:tcPr>
+          <w:p>
+            <w:r>
+              <w:t>11828.41</w:t>
+            </w:r>
+          </w:p>
+        </w:tc>
+        <w:tc>
+          <w:tcPr>
+            <w:tcW w:type="dxa" w:w="1234"/>
+          </w:tcPr>
+          <w:p>
+            <w:r>
+              <w:t>31.05</w:t>
             </w:r>
           </w:p>
         </w:tc>
@@ -593,7 +654,7 @@
       <w:tr>
         <w:tc>
           <w:tcPr>
-            <w:tcW w:type="dxa" w:w="1440"/>
+            <w:tcW w:type="dxa" w:w="1234"/>
           </w:tcPr>
           <w:p>
             <w:r>
@@ -603,7 +664,7 @@
         </w:tc>
         <w:tc>
           <w:tcPr>
-            <w:tcW w:type="dxa" w:w="1440"/>
+            <w:tcW w:type="dxa" w:w="1234"/>
           </w:tcPr>
           <w:p>
             <w:r>
@@ -613,7 +674,7 @@
         </w:tc>
         <w:tc>
           <w:tcPr>
-            <w:tcW w:type="dxa" w:w="1440"/>
+            <w:tcW w:type="dxa" w:w="1234"/>
           </w:tcPr>
           <w:p>
             <w:r>
@@ -623,7 +684,7 @@
         </w:tc>
         <w:tc>
           <w:tcPr>
-            <w:tcW w:type="dxa" w:w="1440"/>
+            <w:tcW w:type="dxa" w:w="1234"/>
           </w:tcPr>
           <w:p>
             <w:r>
@@ -633,7 +694,7 @@
         </w:tc>
         <w:tc>
           <w:tcPr>
-            <w:tcW w:type="dxa" w:w="1440"/>
+            <w:tcW w:type="dxa" w:w="1234"/>
           </w:tcPr>
           <w:p>
             <w:r>
@@ -643,11 +704,21 @@
         </w:tc>
         <w:tc>
           <w:tcPr>
-            <w:tcW w:type="dxa" w:w="1440"/>
-          </w:tcPr>
-          <w:p>
-            <w:r>
-              <w:t>105,092,277</w:t>
+            <w:tcW w:type="dxa" w:w="1234"/>
+          </w:tcPr>
+          <w:p>
+            <w:r>
+              <w:t>10509.23</w:t>
+            </w:r>
+          </w:p>
+        </w:tc>
+        <w:tc>
+          <w:tcPr>
+            <w:tcW w:type="dxa" w:w="1234"/>
+          </w:tcPr>
+          <w:p>
+            <w:r>
+              <w:t>139.08</w:t>
             </w:r>
           </w:p>
         </w:tc>
@@ -655,7 +726,7 @@
       <w:tr>
         <w:tc>
           <w:tcPr>
-            <w:tcW w:type="dxa" w:w="1440"/>
+            <w:tcW w:type="dxa" w:w="1234"/>
           </w:tcPr>
           <w:p>
             <w:r>
@@ -665,7 +736,7 @@
         </w:tc>
         <w:tc>
           <w:tcPr>
-            <w:tcW w:type="dxa" w:w="1440"/>
+            <w:tcW w:type="dxa" w:w="1234"/>
           </w:tcPr>
           <w:p>
             <w:r>
@@ -675,7 +746,7 @@
         </w:tc>
         <w:tc>
           <w:tcPr>
-            <w:tcW w:type="dxa" w:w="1440"/>
+            <w:tcW w:type="dxa" w:w="1234"/>
           </w:tcPr>
           <w:p>
             <w:r>
@@ -685,7 +756,7 @@
         </w:tc>
         <w:tc>
           <w:tcPr>
-            <w:tcW w:type="dxa" w:w="1440"/>
+            <w:tcW w:type="dxa" w:w="1234"/>
           </w:tcPr>
           <w:p>
             <w:r>
@@ -695,7 +766,7 @@
         </w:tc>
         <w:tc>
           <w:tcPr>
-            <w:tcW w:type="dxa" w:w="1440"/>
+            <w:tcW w:type="dxa" w:w="1234"/>
           </w:tcPr>
           <w:p>
             <w:r>
@@ -705,11 +776,21 @@
         </w:tc>
         <w:tc>
           <w:tcPr>
-            <w:tcW w:type="dxa" w:w="1440"/>
-          </w:tcPr>
-          <w:p>
-            <w:r>
-              <w:t>95,919,448</w:t>
+            <w:tcW w:type="dxa" w:w="1234"/>
+          </w:tcPr>
+          <w:p>
+            <w:r>
+              <w:t>9591.94</w:t>
+            </w:r>
+          </w:p>
+        </w:tc>
+        <w:tc>
+          <w:tcPr>
+            <w:tcW w:type="dxa" w:w="1234"/>
+          </w:tcPr>
+          <w:p>
+            <w:r>
+              <w:t>142.62</w:t>
             </w:r>
           </w:p>
         </w:tc>
@@ -717,7 +798,7 @@
       <w:tr>
         <w:tc>
           <w:tcPr>
-            <w:tcW w:type="dxa" w:w="1440"/>
+            <w:tcW w:type="dxa" w:w="1234"/>
           </w:tcPr>
           <w:p>
             <w:r>
@@ -727,7 +808,7 @@
         </w:tc>
         <w:tc>
           <w:tcPr>
-            <w:tcW w:type="dxa" w:w="1440"/>
+            <w:tcW w:type="dxa" w:w="1234"/>
           </w:tcPr>
           <w:p>
             <w:r>
@@ -737,7 +818,7 @@
         </w:tc>
         <w:tc>
           <w:tcPr>
-            <w:tcW w:type="dxa" w:w="1440"/>
+            <w:tcW w:type="dxa" w:w="1234"/>
           </w:tcPr>
           <w:p>
             <w:r>
@@ -747,7 +828,7 @@
         </w:tc>
         <w:tc>
           <w:tcPr>
-            <w:tcW w:type="dxa" w:w="1440"/>
+            <w:tcW w:type="dxa" w:w="1234"/>
           </w:tcPr>
           <w:p>
             <w:r>
@@ -757,7 +838,7 @@
         </w:tc>
         <w:tc>
           <w:tcPr>
-            <w:tcW w:type="dxa" w:w="1440"/>
+            <w:tcW w:type="dxa" w:w="1234"/>
           </w:tcPr>
           <w:p>
             <w:r>
@@ -767,11 +848,21 @@
         </w:tc>
         <w:tc>
           <w:tcPr>
-            <w:tcW w:type="dxa" w:w="1440"/>
-          </w:tcPr>
-          <w:p>
-            <w:r>
-              <w:t>95,919,448</w:t>
+            <w:tcW w:type="dxa" w:w="1234"/>
+          </w:tcPr>
+          <w:p>
+            <w:r>
+              <w:t>9591.94</w:t>
+            </w:r>
+          </w:p>
+        </w:tc>
+        <w:tc>
+          <w:tcPr>
+            <w:tcW w:type="dxa" w:w="1234"/>
+          </w:tcPr>
+          <w:p>
+            <w:r>
+              <w:t>142.62</w:t>
             </w:r>
           </w:p>
         </w:tc>
@@ -779,7 +870,7 @@
       <w:tr>
         <w:tc>
           <w:tcPr>
-            <w:tcW w:type="dxa" w:w="1440"/>
+            <w:tcW w:type="dxa" w:w="1234"/>
           </w:tcPr>
           <w:p>
             <w:r>
@@ -789,7 +880,7 @@
         </w:tc>
         <w:tc>
           <w:tcPr>
-            <w:tcW w:type="dxa" w:w="1440"/>
+            <w:tcW w:type="dxa" w:w="1234"/>
           </w:tcPr>
           <w:p>
             <w:r>
@@ -799,7 +890,7 @@
         </w:tc>
         <w:tc>
           <w:tcPr>
-            <w:tcW w:type="dxa" w:w="1440"/>
+            <w:tcW w:type="dxa" w:w="1234"/>
           </w:tcPr>
           <w:p>
             <w:r>
@@ -809,7 +900,7 @@
         </w:tc>
         <w:tc>
           <w:tcPr>
-            <w:tcW w:type="dxa" w:w="1440"/>
+            <w:tcW w:type="dxa" w:w="1234"/>
           </w:tcPr>
           <w:p>
             <w:r>
@@ -819,7 +910,7 @@
         </w:tc>
         <w:tc>
           <w:tcPr>
-            <w:tcW w:type="dxa" w:w="1440"/>
+            <w:tcW w:type="dxa" w:w="1234"/>
           </w:tcPr>
           <w:p>
             <w:r>
@@ -829,11 +920,21 @@
         </w:tc>
         <w:tc>
           <w:tcPr>
-            <w:tcW w:type="dxa" w:w="1440"/>
-          </w:tcPr>
-          <w:p>
-            <w:r>
-              <w:t>92,277,993</w:t>
+            <w:tcW w:type="dxa" w:w="1234"/>
+          </w:tcPr>
+          <w:p>
+            <w:r>
+              <w:t>9227.80</w:t>
+            </w:r>
+          </w:p>
+        </w:tc>
+        <w:tc>
+          <w:tcPr>
+            <w:tcW w:type="dxa" w:w="1234"/>
+          </w:tcPr>
+          <w:p>
+            <w:r>
+              <w:t>4.77</w:t>
             </w:r>
           </w:p>
         </w:tc>
@@ -841,7 +942,7 @@
       <w:tr>
         <w:tc>
           <w:tcPr>
-            <w:tcW w:type="dxa" w:w="1440"/>
+            <w:tcW w:type="dxa" w:w="1234"/>
           </w:tcPr>
           <w:p>
             <w:r>
@@ -851,7 +952,7 @@
         </w:tc>
         <w:tc>
           <w:tcPr>
-            <w:tcW w:type="dxa" w:w="1440"/>
+            <w:tcW w:type="dxa" w:w="1234"/>
           </w:tcPr>
           <w:p>
             <w:r>
@@ -861,7 +962,7 @@
         </w:tc>
         <w:tc>
           <w:tcPr>
-            <w:tcW w:type="dxa" w:w="1440"/>
+            <w:tcW w:type="dxa" w:w="1234"/>
           </w:tcPr>
           <w:p>
             <w:r>
@@ -871,7 +972,7 @@
         </w:tc>
         <w:tc>
           <w:tcPr>
-            <w:tcW w:type="dxa" w:w="1440"/>
+            <w:tcW w:type="dxa" w:w="1234"/>
           </w:tcPr>
           <w:p>
             <w:r>
@@ -881,7 +982,7 @@
         </w:tc>
         <w:tc>
           <w:tcPr>
-            <w:tcW w:type="dxa" w:w="1440"/>
+            <w:tcW w:type="dxa" w:w="1234"/>
           </w:tcPr>
           <w:p>
             <w:r>
@@ -891,11 +992,21 @@
         </w:tc>
         <w:tc>
           <w:tcPr>
-            <w:tcW w:type="dxa" w:w="1440"/>
-          </w:tcPr>
-          <w:p>
-            <w:r>
-              <w:t>71,581,610</w:t>
+            <w:tcW w:type="dxa" w:w="1234"/>
+          </w:tcPr>
+          <w:p>
+            <w:r>
+              <w:t>7158.16</w:t>
+            </w:r>
+          </w:p>
+        </w:tc>
+        <w:tc>
+          <w:tcPr>
+            <w:tcW w:type="dxa" w:w="1234"/>
+          </w:tcPr>
+          <w:p>
+            <w:r>
+              <w:t>50.60</w:t>
             </w:r>
           </w:p>
         </w:tc>
@@ -903,7 +1014,7 @@
       <w:tr>
         <w:tc>
           <w:tcPr>
-            <w:tcW w:type="dxa" w:w="1440"/>
+            <w:tcW w:type="dxa" w:w="1234"/>
           </w:tcPr>
           <w:p>
             <w:r>
@@ -913,7 +1024,7 @@
         </w:tc>
         <w:tc>
           <w:tcPr>
-            <w:tcW w:type="dxa" w:w="1440"/>
+            <w:tcW w:type="dxa" w:w="1234"/>
           </w:tcPr>
           <w:p>
             <w:r>
@@ -923,7 +1034,7 @@
         </w:tc>
         <w:tc>
           <w:tcPr>
-            <w:tcW w:type="dxa" w:w="1440"/>
+            <w:tcW w:type="dxa" w:w="1234"/>
           </w:tcPr>
           <w:p>
             <w:r>
@@ -933,7 +1044,7 @@
         </w:tc>
         <w:tc>
           <w:tcPr>
-            <w:tcW w:type="dxa" w:w="1440"/>
+            <w:tcW w:type="dxa" w:w="1234"/>
           </w:tcPr>
           <w:p>
             <w:r>
@@ -943,7 +1054,7 @@
         </w:tc>
         <w:tc>
           <w:tcPr>
-            <w:tcW w:type="dxa" w:w="1440"/>
+            <w:tcW w:type="dxa" w:w="1234"/>
           </w:tcPr>
           <w:p>
             <w:r>
@@ -953,11 +1064,21 @@
         </w:tc>
         <w:tc>
           <w:tcPr>
-            <w:tcW w:type="dxa" w:w="1440"/>
-          </w:tcPr>
-          <w:p>
-            <w:r>
-              <w:t>66,909,414</w:t>
+            <w:tcW w:type="dxa" w:w="1234"/>
+          </w:tcPr>
+          <w:p>
+            <w:r>
+              <w:t>6690.94</w:t>
+            </w:r>
+          </w:p>
+        </w:tc>
+        <w:tc>
+          <w:tcPr>
+            <w:tcW w:type="dxa" w:w="1234"/>
+          </w:tcPr>
+          <w:p>
+            <w:r>
+              <w:t>85.11</w:t>
             </w:r>
           </w:p>
         </w:tc>
@@ -965,7 +1086,7 @@
       <w:tr>
         <w:tc>
           <w:tcPr>
-            <w:tcW w:type="dxa" w:w="1440"/>
+            <w:tcW w:type="dxa" w:w="1234"/>
           </w:tcPr>
           <w:p>
             <w:r>
@@ -975,7 +1096,7 @@
         </w:tc>
         <w:tc>
           <w:tcPr>
-            <w:tcW w:type="dxa" w:w="1440"/>
+            <w:tcW w:type="dxa" w:w="1234"/>
           </w:tcPr>
           <w:p>
             <w:r>
@@ -985,7 +1106,7 @@
         </w:tc>
         <w:tc>
           <w:tcPr>
-            <w:tcW w:type="dxa" w:w="1440"/>
+            <w:tcW w:type="dxa" w:w="1234"/>
           </w:tcPr>
           <w:p>
             <w:r>
@@ -995,7 +1116,7 @@
         </w:tc>
         <w:tc>
           <w:tcPr>
-            <w:tcW w:type="dxa" w:w="1440"/>
+            <w:tcW w:type="dxa" w:w="1234"/>
           </w:tcPr>
           <w:p>
             <w:r>
@@ -1005,7 +1126,7 @@
         </w:tc>
         <w:tc>
           <w:tcPr>
-            <w:tcW w:type="dxa" w:w="1440"/>
+            <w:tcW w:type="dxa" w:w="1234"/>
           </w:tcPr>
           <w:p>
             <w:r>
@@ -1015,11 +1136,21 @@
         </w:tc>
         <w:tc>
           <w:tcPr>
-            <w:tcW w:type="dxa" w:w="1440"/>
-          </w:tcPr>
-          <w:p>
-            <w:r>
-              <w:t>65,768,586</w:t>
+            <w:tcW w:type="dxa" w:w="1234"/>
+          </w:tcPr>
+          <w:p>
+            <w:r>
+              <w:t>6576.86</w:t>
+            </w:r>
+          </w:p>
+        </w:tc>
+        <w:tc>
+          <w:tcPr>
+            <w:tcW w:type="dxa" w:w="1234"/>
+          </w:tcPr>
+          <w:p>
+            <w:r>
+              <w:t>39.61</w:t>
             </w:r>
           </w:p>
         </w:tc>
@@ -1027,7 +1158,7 @@
       <w:tr>
         <w:tc>
           <w:tcPr>
-            <w:tcW w:type="dxa" w:w="1440"/>
+            <w:tcW w:type="dxa" w:w="1234"/>
           </w:tcPr>
           <w:p>
             <w:r>
@@ -1037,7 +1168,7 @@
         </w:tc>
         <w:tc>
           <w:tcPr>
-            <w:tcW w:type="dxa" w:w="1440"/>
+            <w:tcW w:type="dxa" w:w="1234"/>
           </w:tcPr>
           <w:p>
             <w:r>
@@ -1047,7 +1178,7 @@
         </w:tc>
         <w:tc>
           <w:tcPr>
-            <w:tcW w:type="dxa" w:w="1440"/>
+            <w:tcW w:type="dxa" w:w="1234"/>
           </w:tcPr>
           <w:p>
             <w:r>
@@ -1057,7 +1188,7 @@
         </w:tc>
         <w:tc>
           <w:tcPr>
-            <w:tcW w:type="dxa" w:w="1440"/>
+            <w:tcW w:type="dxa" w:w="1234"/>
           </w:tcPr>
           <w:p>
             <w:r>
@@ -1067,7 +1198,7 @@
         </w:tc>
         <w:tc>
           <w:tcPr>
-            <w:tcW w:type="dxa" w:w="1440"/>
+            <w:tcW w:type="dxa" w:w="1234"/>
           </w:tcPr>
           <w:p>
             <w:r>
@@ -1077,11 +1208,21 @@
         </w:tc>
         <w:tc>
           <w:tcPr>
-            <w:tcW w:type="dxa" w:w="1440"/>
-          </w:tcPr>
-          <w:p>
-            <w:r>
-              <w:t>42,964,162</w:t>
+            <w:tcW w:type="dxa" w:w="1234"/>
+          </w:tcPr>
+          <w:p>
+            <w:r>
+              <w:t>4296.42</w:t>
+            </w:r>
+          </w:p>
+        </w:tc>
+        <w:tc>
+          <w:tcPr>
+            <w:tcW w:type="dxa" w:w="1234"/>
+          </w:tcPr>
+          <w:p>
+            <w:r>
+              <w:t>100.25</w:t>
             </w:r>
           </w:p>
         </w:tc>
@@ -1089,7 +1230,7 @@
       <w:tr>
         <w:tc>
           <w:tcPr>
-            <w:tcW w:type="dxa" w:w="1440"/>
+            <w:tcW w:type="dxa" w:w="1234"/>
           </w:tcPr>
           <w:p>
             <w:r>
@@ -1099,7 +1240,7 @@
         </w:tc>
         <w:tc>
           <w:tcPr>
-            <w:tcW w:type="dxa" w:w="1440"/>
+            <w:tcW w:type="dxa" w:w="1234"/>
           </w:tcPr>
           <w:p>
             <w:r>
@@ -1109,7 +1250,7 @@
         </w:tc>
         <w:tc>
           <w:tcPr>
-            <w:tcW w:type="dxa" w:w="1440"/>
+            <w:tcW w:type="dxa" w:w="1234"/>
           </w:tcPr>
           <w:p>
             <w:r>
@@ -1119,7 +1260,7 @@
         </w:tc>
         <w:tc>
           <w:tcPr>
-            <w:tcW w:type="dxa" w:w="1440"/>
+            <w:tcW w:type="dxa" w:w="1234"/>
           </w:tcPr>
           <w:p>
             <w:r>
@@ -1129,7 +1270,7 @@
         </w:tc>
         <w:tc>
           <w:tcPr>
-            <w:tcW w:type="dxa" w:w="1440"/>
+            <w:tcW w:type="dxa" w:w="1234"/>
           </w:tcPr>
           <w:p>
             <w:r>
@@ -1139,11 +1280,21 @@
         </w:tc>
         <w:tc>
           <w:tcPr>
-            <w:tcW w:type="dxa" w:w="1440"/>
-          </w:tcPr>
-          <w:p>
-            <w:r>
-              <w:t>32,997,210</w:t>
+            <w:tcW w:type="dxa" w:w="1234"/>
+          </w:tcPr>
+          <w:p>
+            <w:r>
+              <w:t>3299.72</w:t>
+            </w:r>
+          </w:p>
+        </w:tc>
+        <w:tc>
+          <w:tcPr>
+            <w:tcW w:type="dxa" w:w="1234"/>
+          </w:tcPr>
+          <w:p>
+            <w:r>
+              <w:t>159.88</w:t>
             </w:r>
           </w:p>
         </w:tc>
@@ -1151,7 +1302,7 @@
       <w:tr>
         <w:tc>
           <w:tcPr>
-            <w:tcW w:type="dxa" w:w="1440"/>
+            <w:tcW w:type="dxa" w:w="1234"/>
           </w:tcPr>
           <w:p>
             <w:r>
@@ -1161,7 +1312,7 @@
         </w:tc>
         <w:tc>
           <w:tcPr>
-            <w:tcW w:type="dxa" w:w="1440"/>
+            <w:tcW w:type="dxa" w:w="1234"/>
           </w:tcPr>
           <w:p>
             <w:r>
@@ -1171,7 +1322,7 @@
         </w:tc>
         <w:tc>
           <w:tcPr>
-            <w:tcW w:type="dxa" w:w="1440"/>
+            <w:tcW w:type="dxa" w:w="1234"/>
           </w:tcPr>
           <w:p>
             <w:r>
@@ -1181,7 +1332,7 @@
         </w:tc>
         <w:tc>
           <w:tcPr>
-            <w:tcW w:type="dxa" w:w="1440"/>
+            <w:tcW w:type="dxa" w:w="1234"/>
           </w:tcPr>
           <w:p>
             <w:r>
@@ -1191,7 +1342,7 @@
         </w:tc>
         <w:tc>
           <w:tcPr>
-            <w:tcW w:type="dxa" w:w="1440"/>
+            <w:tcW w:type="dxa" w:w="1234"/>
           </w:tcPr>
           <w:p>
             <w:r>
@@ -1201,11 +1352,21 @@
         </w:tc>
         <w:tc>
           <w:tcPr>
-            <w:tcW w:type="dxa" w:w="1440"/>
-          </w:tcPr>
-          <w:p>
-            <w:r>
-              <w:t>30,584,021</w:t>
+            <w:tcW w:type="dxa" w:w="1234"/>
+          </w:tcPr>
+          <w:p>
+            <w:r>
+              <w:t>3058.40</w:t>
+            </w:r>
+          </w:p>
+        </w:tc>
+        <w:tc>
+          <w:tcPr>
+            <w:tcW w:type="dxa" w:w="1234"/>
+          </w:tcPr>
+          <w:p>
+            <w:r>
+              <w:t>4.99</w:t>
             </w:r>
           </w:p>
         </w:tc>

</xml_diff>

<commit_message>
Fix duplicate stocks in TOP15 volume table
</commit_message>
<xml_diff>
--- a/Stock/data/supply_chain_reports/20260610/daily_digest.docx
+++ b/Stock/data/supply_chain_reports/20260610/daily_digest.docx
@@ -13,7 +13,7 @@
     </w:p>
     <w:p>
       <w:r>
-        <w:t>数据来源：新浪财经 | 生成时间：2026-06-10 19:40:35</w:t>
+        <w:t>数据来源：新浪财经 | 生成时间：2026-06-10 19:48:41</w:t>
       </w:r>
     </w:p>
     <w:p>
@@ -956,7 +956,7 @@
           </w:tcPr>
           <w:p>
             <w:r>
-              <w:t>生益科技</w:t>
+              <w:t>英维克</w:t>
             </w:r>
           </w:p>
         </w:tc>
@@ -966,7 +966,7 @@
           </w:tcPr>
           <w:p>
             <w:r>
-              <w:t>600183</w:t>
+              <w:t>002837</w:t>
             </w:r>
           </w:p>
         </w:tc>
@@ -976,7 +976,7 @@
           </w:tcPr>
           <w:p>
             <w:r>
-              <w:t>146.90</w:t>
+              <w:t>68.90</w:t>
             </w:r>
           </w:p>
         </w:tc>
@@ -986,7 +986,7 @@
           </w:tcPr>
           <w:p>
             <w:r>
-              <w:t>-0.39%</w:t>
+              <w:t>-1.18%</w:t>
             </w:r>
           </w:p>
         </w:tc>
@@ -996,7 +996,7 @@
           </w:tcPr>
           <w:p>
             <w:r>
-              <w:t>9591.94</w:t>
+              <w:t>7158.16</w:t>
             </w:r>
           </w:p>
         </w:tc>
@@ -1006,7 +1006,7 @@
           </w:tcPr>
           <w:p>
             <w:r>
-              <w:t>142.62</w:t>
+              <w:t>50.60</w:t>
             </w:r>
           </w:p>
         </w:tc>
@@ -1028,7 +1028,7 @@
           </w:tcPr>
           <w:p>
             <w:r>
-              <w:t>生益科技</w:t>
+              <w:t>中芯国际</w:t>
             </w:r>
           </w:p>
         </w:tc>
@@ -1038,7 +1038,7 @@
           </w:tcPr>
           <w:p>
             <w:r>
-              <w:t>600183</w:t>
+              <w:t>688981</w:t>
             </w:r>
           </w:p>
         </w:tc>
@@ -1048,7 +1048,7 @@
           </w:tcPr>
           <w:p>
             <w:r>
-              <w:t>146.90</w:t>
+              <w:t>125.34</w:t>
             </w:r>
           </w:p>
         </w:tc>
@@ -1058,7 +1058,7 @@
           </w:tcPr>
           <w:p>
             <w:r>
-              <w:t>-0.39%</w:t>
+              <w:t>-1.54%</w:t>
             </w:r>
           </w:p>
         </w:tc>
@@ -1068,7 +1068,7 @@
           </w:tcPr>
           <w:p>
             <w:r>
-              <w:t>9591.94</w:t>
+              <w:t>6690.94</w:t>
             </w:r>
           </w:p>
         </w:tc>
@@ -1078,7 +1078,7 @@
           </w:tcPr>
           <w:p>
             <w:r>
-              <w:t>142.62</w:t>
+              <w:t>85.11</w:t>
             </w:r>
           </w:p>
         </w:tc>
@@ -1100,7 +1100,7 @@
           </w:tcPr>
           <w:p>
             <w:r>
-              <w:t>英维克</w:t>
+              <w:t>浪潮信息</w:t>
             </w:r>
           </w:p>
         </w:tc>
@@ -1110,7 +1110,7 @@
           </w:tcPr>
           <w:p>
             <w:r>
-              <w:t>002837</w:t>
+              <w:t>000977</w:t>
             </w:r>
           </w:p>
         </w:tc>
@@ -1120,7 +1120,7 @@
           </w:tcPr>
           <w:p>
             <w:r>
-              <w:t>68.90</w:t>
+              <w:t>59.39</w:t>
             </w:r>
           </w:p>
         </w:tc>
@@ -1130,7 +1130,7 @@
           </w:tcPr>
           <w:p>
             <w:r>
-              <w:t>-1.18%</w:t>
+              <w:t>-0.12%</w:t>
             </w:r>
           </w:p>
         </w:tc>
@@ -1140,7 +1140,7 @@
           </w:tcPr>
           <w:p>
             <w:r>
-              <w:t>7158.16</w:t>
+              <w:t>6576.86</w:t>
             </w:r>
           </w:p>
         </w:tc>
@@ -1150,7 +1150,7 @@
           </w:tcPr>
           <w:p>
             <w:r>
-              <w:t>50.60</w:t>
+              <w:t>39.61</w:t>
             </w:r>
           </w:p>
         </w:tc>
@@ -1172,7 +1172,7 @@
           </w:tcPr>
           <w:p>
             <w:r>
-              <w:t>中芯国际</w:t>
+              <w:t>澜起科技</w:t>
             </w:r>
           </w:p>
         </w:tc>
@@ -1182,7 +1182,7 @@
           </w:tcPr>
           <w:p>
             <w:r>
-              <w:t>688981</w:t>
+              <w:t>688008</w:t>
             </w:r>
           </w:p>
         </w:tc>
@@ -1192,7 +1192,7 @@
           </w:tcPr>
           <w:p>
             <w:r>
-              <w:t>125.34</w:t>
+              <w:t>231.00</w:t>
             </w:r>
           </w:p>
         </w:tc>
@@ -1202,7 +1202,7 @@
           </w:tcPr>
           <w:p>
             <w:r>
-              <w:t>-1.54%</w:t>
+              <w:t>-2.28%</w:t>
             </w:r>
           </w:p>
         </w:tc>
@@ -1212,7 +1212,7 @@
           </w:tcPr>
           <w:p>
             <w:r>
-              <w:t>6690.94</w:t>
+              <w:t>4296.42</w:t>
             </w:r>
           </w:p>
         </w:tc>
@@ -1222,7 +1222,7 @@
           </w:tcPr>
           <w:p>
             <w:r>
-              <w:t>85.11</w:t>
+              <w:t>100.25</w:t>
             </w:r>
           </w:p>
         </w:tc>
@@ -1244,7 +1244,7 @@
           </w:tcPr>
           <w:p>
             <w:r>
-              <w:t>浪潮信息</w:t>
+              <w:t>兆易创新</w:t>
             </w:r>
           </w:p>
         </w:tc>
@@ -1254,7 +1254,7 @@
           </w:tcPr>
           <w:p>
             <w:r>
-              <w:t>000977</w:t>
+              <w:t>603986</w:t>
             </w:r>
           </w:p>
         </w:tc>
@@ -1264,7 +1264,7 @@
           </w:tcPr>
           <w:p>
             <w:r>
-              <w:t>59.39</w:t>
+              <w:t>480.84</w:t>
             </w:r>
           </w:p>
         </w:tc>
@@ -1274,7 +1274,7 @@
           </w:tcPr>
           <w:p>
             <w:r>
-              <w:t>-0.12%</w:t>
+              <w:t>-3.93%</w:t>
             </w:r>
           </w:p>
         </w:tc>
@@ -1284,7 +1284,7 @@
           </w:tcPr>
           <w:p>
             <w:r>
-              <w:t>6576.86</w:t>
+              <w:t>3299.72</w:t>
             </w:r>
           </w:p>
         </w:tc>
@@ -1294,7 +1294,7 @@
           </w:tcPr>
           <w:p>
             <w:r>
-              <w:t>39.61</w:t>
+              <w:t>159.88</w:t>
             </w:r>
           </w:p>
         </w:tc>
@@ -1316,7 +1316,7 @@
           </w:tcPr>
           <w:p>
             <w:r>
-              <w:t>澜起科技</w:t>
+              <w:t>中微公司</w:t>
             </w:r>
           </w:p>
         </w:tc>
@@ -1326,7 +1326,7 @@
           </w:tcPr>
           <w:p>
             <w:r>
-              <w:t>688008</w:t>
+              <w:t>688012</w:t>
             </w:r>
           </w:p>
         </w:tc>
@@ -1336,7 +1336,7 @@
           </w:tcPr>
           <w:p>
             <w:r>
-              <w:t>231.00</w:t>
+              <w:t>289.11</w:t>
             </w:r>
           </w:p>
         </w:tc>
@@ -1346,7 +1346,7 @@
           </w:tcPr>
           <w:p>
             <w:r>
-              <w:t>-2.28%</w:t>
+              <w:t>+1.43%</w:t>
             </w:r>
           </w:p>
         </w:tc>
@@ -1356,7 +1356,7 @@
           </w:tcPr>
           <w:p>
             <w:r>
-              <w:t>4296.42</w:t>
+              <w:t>2960.79</w:t>
             </w:r>
           </w:p>
         </w:tc>
@@ -1366,7 +1366,7 @@
           </w:tcPr>
           <w:p>
             <w:r>
-              <w:t>100.25</w:t>
+              <w:t>87.05</w:t>
             </w:r>
           </w:p>
         </w:tc>

</xml_diff>